<commit_message>
Refactor coin change program to accept dynamic coin input and improve output formatting
</commit_message>
<xml_diff>
--- a/Practical Files/Docs/DAA-Practical_6.docx
+++ b/Practical Files/Docs/DAA-Practical_6.docx
@@ -2677,6 +2677,7 @@
       <w:r>
         <w:rPr>
           <w:rFonts w:ascii="Times New Roman" w:eastAsia="Times New Roman" w:hAnsi="Times New Roman" w:cs="Times New Roman"/>
+          <w:noProof/>
           <w:sz w:val="24"/>
           <w:szCs w:val="24"/>
         </w:rPr>
@@ -2722,564 +2723,6 @@
             </a:graphic>
           </wp:inline>
         </w:drawing>
-      </w:r>
-    </w:p>
-    <w:p>
-      <w:pPr>
-        <w:spacing w:after="0" w:line="360" w:lineRule="auto"/>
-        <w:ind w:right="29"/>
-        <w:jc w:val="both"/>
-        <w:rPr>
-          <w:rFonts w:ascii="Times New Roman" w:eastAsia="Times New Roman" w:hAnsi="Times New Roman" w:cs="Times New Roman"/>
-          <w:b/>
-          <w:sz w:val="24"/>
-          <w:szCs w:val="24"/>
-        </w:rPr>
-      </w:pPr>
-      <w:r>
-        <w:rPr>
-          <w:rFonts w:ascii="Times New Roman" w:eastAsia="Times New Roman" w:hAnsi="Times New Roman" w:cs="Times New Roman"/>
-          <w:b/>
-          <w:sz w:val="24"/>
-          <w:szCs w:val="24"/>
-        </w:rPr>
-        <w:t>Analysis:</w:t>
-      </w:r>
-    </w:p>
-    <w:p>
-      <w:pPr>
-        <w:spacing w:after="0" w:line="360" w:lineRule="auto"/>
-        <w:ind w:right="29"/>
-        <w:rPr>
-          <w:rFonts w:ascii="Times New Roman" w:eastAsia="Times New Roman" w:hAnsi="Times New Roman" w:cs="Times New Roman"/>
-          <w:sz w:val="24"/>
-          <w:szCs w:val="24"/>
-        </w:rPr>
-      </w:pPr>
-      <w:r>
-        <w:rPr>
-          <w:rFonts w:ascii="Times New Roman" w:eastAsia="Times New Roman" w:hAnsi="Times New Roman" w:cs="Times New Roman"/>
-          <w:sz w:val="24"/>
-          <w:szCs w:val="24"/>
-        </w:rPr>
-        <w:t xml:space="preserve">The greedy algorithm is the optimal solution for the fractional knapsack problem because items can be divided into smaller parts. </w:t>
-      </w:r>
-    </w:p>
-    <w:p>
-      <w:pPr>
-        <w:pStyle w:val="ListParagraph"/>
-        <w:numPr>
-          <w:ilvl w:val="0"/>
-          <w:numId w:val="3"/>
-        </w:numPr>
-        <w:spacing w:after="0" w:line="360" w:lineRule="auto"/>
-        <w:ind w:right="29"/>
-        <w:rPr>
-          <w:rFonts w:ascii="Times New Roman" w:eastAsia="Times New Roman" w:hAnsi="Times New Roman" w:cs="Times New Roman"/>
-          <w:sz w:val="24"/>
-          <w:szCs w:val="24"/>
-        </w:rPr>
-      </w:pPr>
-      <w:r>
-        <w:rPr>
-          <w:rFonts w:ascii="Times New Roman" w:eastAsia="Times New Roman" w:hAnsi="Times New Roman" w:cs="Times New Roman"/>
-          <w:b/>
-          <w:bCs/>
-          <w:sz w:val="24"/>
-          <w:szCs w:val="24"/>
-        </w:rPr>
-        <w:t>Strategy:</w:t>
-      </w:r>
-      <w:r>
-        <w:rPr>
-          <w:rFonts w:ascii="Times New Roman" w:eastAsia="Times New Roman" w:hAnsi="Times New Roman" w:cs="Times New Roman"/>
-          <w:sz w:val="24"/>
-          <w:szCs w:val="24"/>
-        </w:rPr>
-        <w:t xml:space="preserve"> Calculate the value-to-weight ratio </w:t>
-      </w:r>
-      <w:r>
-        <w:rPr>
-          <w:rFonts w:ascii="Times New Roman" w:eastAsia="Times New Roman" w:hAnsi="Times New Roman" w:cs="Times New Roman"/>
-          <w:i/>
-          <w:iCs/>
-          <w:sz w:val="24"/>
-          <w:szCs w:val="24"/>
-        </w:rPr>
-        <w:t>(</w:t>
-      </w:r>
-      <w:r>
-        <w:rPr>
-          <w:rFonts w:ascii="Times New Roman" w:eastAsia="Times New Roman" w:hAnsi="Times New Roman" w:cs="Times New Roman"/>
-          <w:i/>
-          <w:iCs/>
-          <w:sz w:val="24"/>
-          <w:szCs w:val="24"/>
-          <w:u w:val="single"/>
-        </w:rPr>
-        <w:t>v</w:t>
-      </w:r>
-      <w:r>
-        <w:rPr>
-          <w:rFonts w:ascii="Times New Roman" w:eastAsia="Times New Roman" w:hAnsi="Times New Roman" w:cs="Times New Roman"/>
-          <w:i/>
-          <w:iCs/>
-          <w:sz w:val="24"/>
-          <w:szCs w:val="24"/>
-          <w:u w:val="single"/>
-          <w:vertAlign w:val="subscript"/>
-        </w:rPr>
-        <w:t>i</w:t>
-      </w:r>
-      <w:r>
-        <w:rPr>
-          <w:rFonts w:ascii="Times New Roman" w:eastAsia="Times New Roman" w:hAnsi="Times New Roman" w:cs="Times New Roman"/>
-          <w:i/>
-          <w:iCs/>
-          <w:sz w:val="24"/>
-          <w:szCs w:val="24"/>
-          <w:u w:val="single"/>
-        </w:rPr>
-        <w:t>/</w:t>
-      </w:r>
-      <w:proofErr w:type="spellStart"/>
-      <w:r>
-        <w:rPr>
-          <w:rFonts w:ascii="Times New Roman" w:eastAsia="Times New Roman" w:hAnsi="Times New Roman" w:cs="Times New Roman"/>
-          <w:i/>
-          <w:iCs/>
-          <w:sz w:val="24"/>
-          <w:szCs w:val="24"/>
-          <w:u w:val="single"/>
-        </w:rPr>
-        <w:t>w</w:t>
-      </w:r>
-      <w:r>
-        <w:rPr>
-          <w:rFonts w:ascii="Times New Roman" w:eastAsia="Times New Roman" w:hAnsi="Times New Roman" w:cs="Times New Roman"/>
-          <w:i/>
-          <w:iCs/>
-          <w:sz w:val="24"/>
-          <w:szCs w:val="24"/>
-          <w:u w:val="single"/>
-          <w:vertAlign w:val="subscript"/>
-        </w:rPr>
-        <w:t>i</w:t>
-      </w:r>
-      <w:proofErr w:type="spellEnd"/>
-      <w:r>
-        <w:rPr>
-          <w:rFonts w:ascii="Times New Roman" w:eastAsia="Times New Roman" w:hAnsi="Times New Roman" w:cs="Times New Roman"/>
-          <w:i/>
-          <w:iCs/>
-          <w:sz w:val="24"/>
-          <w:szCs w:val="24"/>
-        </w:rPr>
-        <w:t>)</w:t>
-      </w:r>
-      <w:r>
-        <w:rPr>
-          <w:rFonts w:ascii="Times New Roman" w:eastAsia="Times New Roman" w:hAnsi="Times New Roman" w:cs="Times New Roman"/>
-          <w:sz w:val="24"/>
-          <w:szCs w:val="24"/>
-        </w:rPr>
-        <w:t xml:space="preserve"> for each item and sort them in descending order.</w:t>
-      </w:r>
-    </w:p>
-    <w:p>
-      <w:pPr>
-        <w:pStyle w:val="ListParagraph"/>
-        <w:numPr>
-          <w:ilvl w:val="0"/>
-          <w:numId w:val="3"/>
-        </w:numPr>
-        <w:spacing w:after="0" w:line="360" w:lineRule="auto"/>
-        <w:ind w:right="29"/>
-        <w:rPr>
-          <w:rFonts w:ascii="Times New Roman" w:eastAsia="Times New Roman" w:hAnsi="Times New Roman" w:cs="Times New Roman"/>
-          <w:sz w:val="24"/>
-          <w:szCs w:val="24"/>
-        </w:rPr>
-      </w:pPr>
-      <w:r>
-        <w:rPr>
-          <w:rFonts w:ascii="Times New Roman" w:eastAsia="Times New Roman" w:hAnsi="Times New Roman" w:cs="Times New Roman"/>
-          <w:b/>
-          <w:bCs/>
-          <w:sz w:val="24"/>
-          <w:szCs w:val="24"/>
-        </w:rPr>
-        <w:t>Execution:</w:t>
-      </w:r>
-      <w:r>
-        <w:rPr>
-          <w:rFonts w:ascii="Times New Roman" w:eastAsia="Times New Roman" w:hAnsi="Times New Roman" w:cs="Times New Roman"/>
-          <w:sz w:val="24"/>
-          <w:szCs w:val="24"/>
-        </w:rPr>
-        <w:t xml:space="preserve"> Select the item with the highest ratio first. If it fits, take the whole item; if not, take the</w:t>
-      </w:r>
-      <w:r>
-        <w:rPr>
-          <w:rFonts w:ascii="Times New Roman" w:eastAsia="Times New Roman" w:hAnsi="Times New Roman" w:cs="Times New Roman"/>
-          <w:sz w:val="24"/>
-          <w:szCs w:val="24"/>
-        </w:rPr>
-        <w:t xml:space="preserve"> </w:t>
-      </w:r>
-      <w:r>
-        <w:rPr>
-          <w:rFonts w:ascii="Times New Roman" w:eastAsia="Times New Roman" w:hAnsi="Times New Roman" w:cs="Times New Roman"/>
-          <w:sz w:val="24"/>
-          <w:szCs w:val="24"/>
-        </w:rPr>
-        <w:t>fractional portion that fills the remaining capacity.</w:t>
-      </w:r>
-    </w:p>
-    <w:p>
-      <w:pPr>
-        <w:pStyle w:val="ListParagraph"/>
-        <w:numPr>
-          <w:ilvl w:val="0"/>
-          <w:numId w:val="3"/>
-        </w:numPr>
-        <w:spacing w:after="0" w:line="360" w:lineRule="auto"/>
-        <w:ind w:right="29"/>
-        <w:rPr>
-          <w:rFonts w:ascii="Times New Roman" w:eastAsia="Times New Roman" w:hAnsi="Times New Roman" w:cs="Times New Roman"/>
-          <w:b/>
-          <w:bCs/>
-          <w:sz w:val="24"/>
-          <w:szCs w:val="24"/>
-        </w:rPr>
-      </w:pPr>
-      <w:r>
-        <w:rPr>
-          <w:rFonts w:ascii="Times New Roman" w:eastAsia="Times New Roman" w:hAnsi="Times New Roman" w:cs="Times New Roman"/>
-          <w:b/>
-          <w:bCs/>
-          <w:sz w:val="24"/>
-          <w:szCs w:val="24"/>
-        </w:rPr>
-        <w:t xml:space="preserve">Time Complexity: </w:t>
-      </w:r>
-      <w:proofErr w:type="gramStart"/>
-      <w:r>
-        <w:rPr>
-          <w:rFonts w:ascii="Times New Roman" w:eastAsia="Times New Roman" w:hAnsi="Times New Roman" w:cs="Times New Roman"/>
-          <w:i/>
-          <w:iCs/>
-          <w:sz w:val="24"/>
-          <w:szCs w:val="24"/>
-        </w:rPr>
-        <w:t>O(</w:t>
-      </w:r>
-      <w:proofErr w:type="gramEnd"/>
-      <w:r>
-        <w:rPr>
-          <w:rFonts w:ascii="Times New Roman" w:eastAsia="Times New Roman" w:hAnsi="Times New Roman" w:cs="Times New Roman"/>
-          <w:i/>
-          <w:iCs/>
-          <w:sz w:val="24"/>
-          <w:szCs w:val="24"/>
-        </w:rPr>
-        <w:t>n log n)</w:t>
-      </w:r>
-      <w:r>
-        <w:rPr>
-          <w:rFonts w:ascii="Times New Roman" w:eastAsia="Times New Roman" w:hAnsi="Times New Roman" w:cs="Times New Roman"/>
-          <w:sz w:val="24"/>
-          <w:szCs w:val="24"/>
-        </w:rPr>
-        <w:t xml:space="preserve"> </w:t>
-      </w:r>
-      <w:r>
-        <w:rPr>
-          <w:rFonts w:ascii="Times New Roman" w:eastAsia="Times New Roman" w:hAnsi="Times New Roman" w:cs="Times New Roman"/>
-          <w:sz w:val="24"/>
-          <w:szCs w:val="24"/>
-        </w:rPr>
-        <w:t>due to the sorting step. The subsequent selection process takes</w:t>
-      </w:r>
-      <w:r>
-        <w:rPr>
-          <w:rFonts w:ascii="Times New Roman" w:eastAsia="Times New Roman" w:hAnsi="Times New Roman" w:cs="Times New Roman"/>
-          <w:sz w:val="24"/>
-          <w:szCs w:val="24"/>
-        </w:rPr>
-        <w:t xml:space="preserve"> </w:t>
-      </w:r>
-      <w:r>
-        <w:rPr>
-          <w:rFonts w:ascii="Times New Roman" w:eastAsia="Times New Roman" w:hAnsi="Times New Roman" w:cs="Times New Roman"/>
-          <w:i/>
-          <w:iCs/>
-          <w:sz w:val="24"/>
-          <w:szCs w:val="24"/>
-        </w:rPr>
-        <w:t>O(n)</w:t>
-      </w:r>
-      <w:r>
-        <w:rPr>
-          <w:rFonts w:ascii="Times New Roman" w:eastAsia="Times New Roman" w:hAnsi="Times New Roman" w:cs="Times New Roman"/>
-          <w:sz w:val="24"/>
-          <w:szCs w:val="24"/>
-        </w:rPr>
-        <w:t>.</w:t>
-      </w:r>
-    </w:p>
-    <w:p>
-      <w:pPr>
-        <w:pStyle w:val="ListParagraph"/>
-        <w:numPr>
-          <w:ilvl w:val="0"/>
-          <w:numId w:val="3"/>
-        </w:numPr>
-        <w:spacing w:after="0" w:line="360" w:lineRule="auto"/>
-        <w:ind w:right="29"/>
-        <w:rPr>
-          <w:rFonts w:ascii="Times New Roman" w:eastAsia="Times New Roman" w:hAnsi="Times New Roman" w:cs="Times New Roman"/>
-          <w:b/>
-          <w:bCs/>
-          <w:sz w:val="24"/>
-          <w:szCs w:val="24"/>
-        </w:rPr>
-      </w:pPr>
-      <w:r>
-        <w:rPr>
-          <w:rFonts w:ascii="Times New Roman" w:eastAsia="Times New Roman" w:hAnsi="Times New Roman" w:cs="Times New Roman"/>
-          <w:b/>
-          <w:bCs/>
-          <w:sz w:val="24"/>
-          <w:szCs w:val="24"/>
-        </w:rPr>
-        <w:t>Space Complexity:</w:t>
-      </w:r>
-      <w:r>
-        <w:rPr>
-          <w:rFonts w:ascii="Times New Roman" w:eastAsia="Times New Roman" w:hAnsi="Times New Roman" w:cs="Times New Roman"/>
-          <w:b/>
-          <w:bCs/>
-          <w:sz w:val="24"/>
-          <w:szCs w:val="24"/>
-        </w:rPr>
-        <w:t xml:space="preserve"> </w:t>
-      </w:r>
-      <w:r>
-        <w:rPr>
-          <w:rFonts w:ascii="Times New Roman" w:eastAsia="Times New Roman" w:hAnsi="Times New Roman" w:cs="Times New Roman"/>
-          <w:i/>
-          <w:iCs/>
-          <w:sz w:val="24"/>
-          <w:szCs w:val="24"/>
-        </w:rPr>
-        <w:t>O(n)</w:t>
-      </w:r>
-      <w:r>
-        <w:rPr>
-          <w:rFonts w:ascii="Times New Roman" w:eastAsia="Times New Roman" w:hAnsi="Times New Roman" w:cs="Times New Roman"/>
-          <w:sz w:val="24"/>
-          <w:szCs w:val="24"/>
-        </w:rPr>
-        <w:t xml:space="preserve"> beyond storing the inpu</w:t>
-      </w:r>
-      <w:r>
-        <w:rPr>
-          <w:rFonts w:ascii="Times New Roman" w:eastAsia="Times New Roman" w:hAnsi="Times New Roman" w:cs="Times New Roman"/>
-          <w:sz w:val="24"/>
-          <w:szCs w:val="24"/>
-        </w:rPr>
-        <w:t>t.</w:t>
-      </w:r>
-    </w:p>
-    <w:p>
-      <w:pPr>
-        <w:spacing w:after="0" w:line="360" w:lineRule="auto"/>
-        <w:ind w:right="29"/>
-        <w:rPr>
-          <w:rFonts w:ascii="Times New Roman" w:eastAsia="Times New Roman" w:hAnsi="Times New Roman" w:cs="Times New Roman"/>
-          <w:b/>
-          <w:bCs/>
-          <w:sz w:val="24"/>
-          <w:szCs w:val="24"/>
-        </w:rPr>
-      </w:pPr>
-    </w:p>
-    <w:p>
-      <w:pPr>
-        <w:spacing w:after="0" w:line="360" w:lineRule="auto"/>
-        <w:ind w:right="29"/>
-        <w:jc w:val="both"/>
-        <w:rPr>
-          <w:rFonts w:ascii="Times New Roman" w:eastAsia="Times New Roman" w:hAnsi="Times New Roman" w:cs="Times New Roman"/>
-          <w:b/>
-          <w:sz w:val="24"/>
-          <w:szCs w:val="24"/>
-        </w:rPr>
-      </w:pPr>
-      <w:r>
-        <w:rPr>
-          <w:rFonts w:ascii="Times New Roman" w:eastAsia="Times New Roman" w:hAnsi="Times New Roman" w:cs="Times New Roman"/>
-          <w:b/>
-          <w:sz w:val="24"/>
-          <w:szCs w:val="24"/>
-        </w:rPr>
-        <w:t>Conclusion:</w:t>
-      </w:r>
-    </w:p>
-    <w:p>
-      <w:pPr>
-        <w:spacing w:after="0" w:line="360" w:lineRule="auto"/>
-        <w:ind w:right="29"/>
-        <w:rPr>
-          <w:rFonts w:ascii="Times New Roman" w:eastAsia="Times New Roman" w:hAnsi="Times New Roman" w:cs="Times New Roman"/>
-          <w:sz w:val="24"/>
-          <w:szCs w:val="24"/>
-        </w:rPr>
-      </w:pPr>
-      <w:r>
-        <w:rPr>
-          <w:rFonts w:ascii="Times New Roman" w:eastAsia="Times New Roman" w:hAnsi="Times New Roman" w:cs="Times New Roman"/>
-          <w:sz w:val="24"/>
-          <w:szCs w:val="24"/>
-        </w:rPr>
-        <w:t>The fractional model is frequently applied in industries where resources are divisible or can be allocated proportionally:</w:t>
-      </w:r>
-    </w:p>
-    <w:p>
-      <w:pPr>
-        <w:pStyle w:val="ListParagraph"/>
-        <w:numPr>
-          <w:ilvl w:val="0"/>
-          <w:numId w:val="2"/>
-        </w:numPr>
-        <w:spacing w:after="0" w:line="360" w:lineRule="auto"/>
-        <w:ind w:right="29"/>
-        <w:rPr>
-          <w:rFonts w:ascii="Times New Roman" w:eastAsia="Times New Roman" w:hAnsi="Times New Roman" w:cs="Times New Roman"/>
-          <w:sz w:val="24"/>
-          <w:szCs w:val="24"/>
-        </w:rPr>
-      </w:pPr>
-      <w:r>
-        <w:rPr>
-          <w:rFonts w:ascii="Times New Roman" w:eastAsia="Times New Roman" w:hAnsi="Times New Roman" w:cs="Times New Roman"/>
-          <w:b/>
-          <w:bCs/>
-          <w:sz w:val="24"/>
-          <w:szCs w:val="24"/>
-        </w:rPr>
-        <w:t>Logistics &amp; Shipping:</w:t>
-      </w:r>
-      <w:r>
-        <w:rPr>
-          <w:rFonts w:ascii="Times New Roman" w:eastAsia="Times New Roman" w:hAnsi="Times New Roman" w:cs="Times New Roman"/>
-          <w:sz w:val="24"/>
-          <w:szCs w:val="24"/>
-        </w:rPr>
-        <w:t xml:space="preserve"> Optimizing cargo value for bulk materials like fuel, liquids, or powders.</w:t>
-      </w:r>
-    </w:p>
-    <w:p>
-      <w:pPr>
-        <w:pStyle w:val="ListParagraph"/>
-        <w:numPr>
-          <w:ilvl w:val="0"/>
-          <w:numId w:val="2"/>
-        </w:numPr>
-        <w:spacing w:after="0" w:line="360" w:lineRule="auto"/>
-        <w:ind w:right="29"/>
-        <w:rPr>
-          <w:rFonts w:ascii="Times New Roman" w:eastAsia="Times New Roman" w:hAnsi="Times New Roman" w:cs="Times New Roman"/>
-          <w:sz w:val="24"/>
-          <w:szCs w:val="24"/>
-        </w:rPr>
-      </w:pPr>
-      <w:r>
-        <w:rPr>
-          <w:rFonts w:ascii="Times New Roman" w:eastAsia="Times New Roman" w:hAnsi="Times New Roman" w:cs="Times New Roman"/>
-          <w:b/>
-          <w:bCs/>
-          <w:sz w:val="24"/>
-          <w:szCs w:val="24"/>
-        </w:rPr>
-        <w:t>Finance &amp; Portfolios:</w:t>
-      </w:r>
-      <w:r>
-        <w:rPr>
-          <w:rFonts w:ascii="Times New Roman" w:eastAsia="Times New Roman" w:hAnsi="Times New Roman" w:cs="Times New Roman"/>
-          <w:sz w:val="24"/>
-          <w:szCs w:val="24"/>
-        </w:rPr>
-        <w:t xml:space="preserve"> Allocating investment capital among various assets to maximize expected returns relative to risk.</w:t>
-      </w:r>
-    </w:p>
-    <w:p>
-      <w:pPr>
-        <w:pStyle w:val="ListParagraph"/>
-        <w:numPr>
-          <w:ilvl w:val="0"/>
-          <w:numId w:val="2"/>
-        </w:numPr>
-        <w:spacing w:after="0" w:line="360" w:lineRule="auto"/>
-        <w:ind w:right="29"/>
-        <w:rPr>
-          <w:rFonts w:ascii="Times New Roman" w:eastAsia="Times New Roman" w:hAnsi="Times New Roman" w:cs="Times New Roman"/>
-          <w:sz w:val="24"/>
-          <w:szCs w:val="24"/>
-        </w:rPr>
-      </w:pPr>
-      <w:r>
-        <w:rPr>
-          <w:rFonts w:ascii="Times New Roman" w:eastAsia="Times New Roman" w:hAnsi="Times New Roman" w:cs="Times New Roman"/>
-          <w:b/>
-          <w:bCs/>
-          <w:sz w:val="24"/>
-          <w:szCs w:val="24"/>
-        </w:rPr>
-        <w:t>Resource Allocation in IT:</w:t>
-      </w:r>
-      <w:r>
-        <w:rPr>
-          <w:rFonts w:ascii="Times New Roman" w:eastAsia="Times New Roman" w:hAnsi="Times New Roman" w:cs="Times New Roman"/>
-          <w:sz w:val="24"/>
-          <w:szCs w:val="24"/>
-        </w:rPr>
-        <w:t xml:space="preserve"> Distributing CPU time or cloud storage among competing tasks.</w:t>
-      </w:r>
-    </w:p>
-    <w:p>
-      <w:pPr>
-        <w:pStyle w:val="ListParagraph"/>
-        <w:numPr>
-          <w:ilvl w:val="0"/>
-          <w:numId w:val="2"/>
-        </w:numPr>
-        <w:spacing w:after="0" w:line="360" w:lineRule="auto"/>
-        <w:ind w:right="29"/>
-        <w:rPr>
-          <w:rFonts w:ascii="Times New Roman" w:eastAsia="Times New Roman" w:hAnsi="Times New Roman" w:cs="Times New Roman"/>
-          <w:sz w:val="24"/>
-          <w:szCs w:val="24"/>
-        </w:rPr>
-      </w:pPr>
-      <w:r>
-        <w:rPr>
-          <w:rFonts w:ascii="Times New Roman" w:eastAsia="Times New Roman" w:hAnsi="Times New Roman" w:cs="Times New Roman"/>
-          <w:b/>
-          <w:bCs/>
-          <w:sz w:val="24"/>
-          <w:szCs w:val="24"/>
-        </w:rPr>
-        <w:t>Disaster Relief:</w:t>
-      </w:r>
-      <w:r>
-        <w:rPr>
-          <w:rFonts w:ascii="Times New Roman" w:eastAsia="Times New Roman" w:hAnsi="Times New Roman" w:cs="Times New Roman"/>
-          <w:sz w:val="24"/>
-          <w:szCs w:val="24"/>
-        </w:rPr>
-        <w:t xml:space="preserve"> Prioritizing food and medicine supplies in humanitarian operations based on their weight efficiency.</w:t>
       </w:r>
     </w:p>
     <w:sectPr>

</xml_diff>